<commit_message>
Refresh Zephyr COSS HAS/MAS source docs in docs/reference
Update the reference .docx files with the latest edits. The machine-readable
markdown (data/doc) and RTL are unaffected — the register map, requirements,
and performance tables are unchanged.

Co-authored-by: Copilot <223556219+Copilot@users.noreply.github.com>
</commit_message>
<xml_diff>
--- a/docs/reference/Zephyr_COSS_HAS_WIP.docx
+++ b/docs/reference/Zephyr_COSS_HAS_WIP.docx
@@ -655,7 +655,21 @@
                 <w:sz w:val="19"/>
                 <w:szCs w:val="19"/>
               </w:rPr>
-              <w:t>M. Piske</w:t>
+              <w:t>M</w:t>
+            </w:r>
+            <w:r>
+              <w:rPr>
+                <w:sz w:val="19"/>
+                <w:szCs w:val="19"/>
+              </w:rPr>
+              <w:t>ayuresh</w:t>
+            </w:r>
+            <w:r>
+              <w:rPr>
+                <w:sz w:val="19"/>
+                <w:szCs w:val="19"/>
+              </w:rPr>
+              <w:t xml:space="preserve"> Piske</w:t>
             </w:r>
           </w:p>
         </w:tc>
@@ -683,7 +697,7 @@
                 <w:sz w:val="19"/>
                 <w:szCs w:val="19"/>
               </w:rPr>
-              <w:t>Initial WIP draft for Hackathon 2026 submission.</w:t>
+              <w:t>Initial Draft V01</w:t>
             </w:r>
           </w:p>
         </w:tc>
@@ -2437,7 +2451,6 @@
     </w:sdt>
     <w:p>
       <w:r>
-        <w:lastRenderedPageBreak/>
         <w:br w:type="page"/>
       </w:r>
     </w:p>

</xml_diff>